<commit_message>
docs: update onboarding guide for simplified project setup
</commit_message>
<xml_diff>
--- a/docs/user-guide/AI-Test-Officer-使用说明.docx
+++ b/docs/user-guide/AI-Test-Officer-使用说明.docx
@@ -8,7 +8,7 @@
       </w:pPr>
       <w:r>
         <w:rPr>
-          <w:rFonts w:ascii="Aptos" w:hAnsi="Aptos" w:eastAsia="PingFang SC"/>
+          <w:rFonts w:ascii="PingFang SC" w:hAnsi="PingFang SC" w:eastAsia="PingFang SC" w:cs="PingFang SC" w:hint="eastAsia"/>
           <w:b/>
           <w:color w:val="18352D"/>
           <w:sz w:val="20"/>
@@ -22,7 +22,7 @@
       </w:pPr>
       <w:r>
         <w:rPr>
-          <w:rFonts w:ascii="Aptos Display" w:hAnsi="Aptos Display" w:eastAsia="PingFang SC"/>
+          <w:rFonts w:ascii="PingFang SC" w:hAnsi="PingFang SC" w:eastAsia="PingFang SC" w:cs="PingFang SC" w:hint="eastAsia"/>
           <w:b/>
           <w:color w:val="18352D"/>
           <w:sz w:val="60"/>
@@ -36,7 +36,7 @@
       </w:pPr>
       <w:r>
         <w:rPr>
-          <w:rFonts w:ascii="Aptos" w:hAnsi="Aptos" w:eastAsia="PingFang SC"/>
+          <w:rFonts w:ascii="PingFang SC" w:hAnsi="PingFang SC" w:eastAsia="PingFang SC" w:cs="PingFang SC" w:hint="eastAsia"/>
           <w:color w:val="5C6A61"/>
           <w:sz w:val="26"/>
         </w:rPr>
@@ -51,7 +51,7 @@
       </w:pPr>
       <w:r>
         <w:rPr>
-          <w:rFonts w:ascii="Aptos" w:hAnsi="Aptos" w:eastAsia="PingFang SC"/>
+          <w:rFonts w:ascii="PingFang SC" w:hAnsi="PingFang SC" w:eastAsia="PingFang SC" w:cs="PingFang SC" w:hint="eastAsia"/>
           <w:b/>
           <w:color w:val="18352D"/>
           <w:sz w:val="21"/>
@@ -60,7 +60,7 @@
       </w:r>
       <w:r>
         <w:rPr>
-          <w:rFonts w:ascii="Aptos" w:hAnsi="Aptos" w:eastAsia="PingFang SC"/>
+          <w:rFonts w:ascii="PingFang SC" w:hAnsi="PingFang SC" w:eastAsia="PingFang SC" w:cs="PingFang SC" w:hint="eastAsia"/>
           <w:color w:val="1B231F"/>
           <w:sz w:val="21"/>
         </w:rPr>
@@ -73,7 +73,7 @@
       </w:pPr>
       <w:r>
         <w:rPr>
-          <w:rFonts w:ascii="Aptos" w:hAnsi="Aptos" w:eastAsia="PingFang SC"/>
+          <w:rFonts w:ascii="PingFang SC" w:hAnsi="PingFang SC" w:eastAsia="PingFang SC" w:cs="PingFang SC" w:hint="eastAsia"/>
         </w:rPr>
         <w:t>你只需要完成这 4 件事</w:t>
       </w:r>
@@ -84,7 +84,7 @@
       </w:pPr>
       <w:r>
         <w:rPr>
-          <w:rFonts w:ascii="Aptos" w:hAnsi="Aptos" w:eastAsia="PingFang SC"/>
+          <w:rFonts w:ascii="PingFang SC" w:hAnsi="PingFang SC" w:eastAsia="PingFang SC" w:cs="PingFang SC" w:hint="eastAsia"/>
           <w:b/>
           <w:color w:val="18352D"/>
           <w:sz w:val="21"/>
@@ -93,7 +93,7 @@
       </w:r>
       <w:r>
         <w:rPr>
-          <w:rFonts w:ascii="Aptos" w:hAnsi="Aptos" w:eastAsia="PingFang SC"/>
+          <w:rFonts w:ascii="PingFang SC" w:hAnsi="PingFang SC" w:eastAsia="PingFang SC" w:cs="PingFang SC" w:hint="eastAsia"/>
           <w:color w:val="1B231F"/>
           <w:sz w:val="21"/>
         </w:rPr>
@@ -106,7 +106,7 @@
       </w:pPr>
       <w:r>
         <w:rPr>
-          <w:rFonts w:ascii="Aptos" w:hAnsi="Aptos" w:eastAsia="PingFang SC"/>
+          <w:rFonts w:ascii="PingFang SC" w:hAnsi="PingFang SC" w:eastAsia="PingFang SC" w:cs="PingFang SC" w:hint="eastAsia"/>
           <w:b/>
           <w:color w:val="18352D"/>
           <w:sz w:val="21"/>
@@ -115,7 +115,7 @@
       </w:r>
       <w:r>
         <w:rPr>
-          <w:rFonts w:ascii="Aptos" w:hAnsi="Aptos" w:eastAsia="PingFang SC"/>
+          <w:rFonts w:ascii="PingFang SC" w:hAnsi="PingFang SC" w:eastAsia="PingFang SC" w:cs="PingFang SC" w:hint="eastAsia"/>
           <w:color w:val="1B231F"/>
           <w:sz w:val="21"/>
         </w:rPr>
@@ -128,7 +128,7 @@
       </w:pPr>
       <w:r>
         <w:rPr>
-          <w:rFonts w:ascii="Aptos" w:hAnsi="Aptos" w:eastAsia="PingFang SC"/>
+          <w:rFonts w:ascii="PingFang SC" w:hAnsi="PingFang SC" w:eastAsia="PingFang SC" w:cs="PingFang SC" w:hint="eastAsia"/>
           <w:b/>
           <w:color w:val="18352D"/>
           <w:sz w:val="21"/>
@@ -137,7 +137,7 @@
       </w:r>
       <w:r>
         <w:rPr>
-          <w:rFonts w:ascii="Aptos" w:hAnsi="Aptos" w:eastAsia="PingFang SC"/>
+          <w:rFonts w:ascii="PingFang SC" w:hAnsi="PingFang SC" w:eastAsia="PingFang SC" w:cs="PingFang SC" w:hint="eastAsia"/>
           <w:color w:val="1B231F"/>
           <w:sz w:val="21"/>
         </w:rPr>
@@ -150,7 +150,7 @@
       </w:pPr>
       <w:r>
         <w:rPr>
-          <w:rFonts w:ascii="Aptos" w:hAnsi="Aptos" w:eastAsia="PingFang SC"/>
+          <w:rFonts w:ascii="PingFang SC" w:hAnsi="PingFang SC" w:eastAsia="PingFang SC" w:cs="PingFang SC" w:hint="eastAsia"/>
           <w:b/>
           <w:color w:val="18352D"/>
           <w:sz w:val="21"/>
@@ -159,7 +159,7 @@
       </w:r>
       <w:r>
         <w:rPr>
-          <w:rFonts w:ascii="Aptos" w:hAnsi="Aptos" w:eastAsia="PingFang SC"/>
+          <w:rFonts w:ascii="PingFang SC" w:hAnsi="PingFang SC" w:eastAsia="PingFang SC" w:cs="PingFang SC" w:hint="eastAsia"/>
           <w:color w:val="1B231F"/>
           <w:sz w:val="21"/>
         </w:rPr>
@@ -177,7 +177,7 @@
       </w:pPr>
       <w:r>
         <w:rPr>
-          <w:rFonts w:ascii="Aptos" w:hAnsi="Aptos" w:eastAsia="PingFang SC"/>
+          <w:rFonts w:ascii="PingFang SC" w:hAnsi="PingFang SC" w:eastAsia="PingFang SC" w:cs="PingFang SC" w:hint="eastAsia"/>
         </w:rPr>
         <w:t>1. 先认识主界面</w:t>
       </w:r>
@@ -188,7 +188,7 @@
       </w:pPr>
       <w:r>
         <w:rPr>
-          <w:rFonts w:ascii="Aptos" w:hAnsi="Aptos" w:eastAsia="PingFang SC"/>
+          <w:rFonts w:ascii="PingFang SC" w:hAnsi="PingFang SC" w:eastAsia="PingFang SC" w:cs="PingFang SC" w:hint="eastAsia"/>
         </w:rPr>
         <w:t>打开工作台后，不需要理解所有技术词。先把画面当作一个测试任务驾驶舱：左边决定测什么，中间显示 AI 正在做什么，右边告诉你结果和下一步。</w:t>
       </w:r>
@@ -240,7 +240,7 @@
       </w:pPr>
       <w:r>
         <w:rPr>
-          <w:rFonts w:ascii="Aptos" w:hAnsi="Aptos" w:eastAsia="PingFang SC"/>
+          <w:rFonts w:ascii="PingFang SC" w:hAnsi="PingFang SC" w:eastAsia="PingFang SC" w:cs="PingFang SC" w:hint="eastAsia"/>
           <w:color w:val="5C6A61"/>
           <w:sz w:val="18"/>
         </w:rPr>
@@ -253,7 +253,7 @@
       </w:pPr>
       <w:r>
         <w:rPr>
-          <w:rFonts w:ascii="Aptos" w:hAnsi="Aptos" w:eastAsia="PingFang SC"/>
+          <w:rFonts w:ascii="PingFang SC" w:hAnsi="PingFang SC" w:eastAsia="PingFang SC" w:cs="PingFang SC" w:hint="eastAsia"/>
           <w:b/>
           <w:color w:val="18352D"/>
           <w:sz w:val="22"/>
@@ -267,7 +267,7 @@
       </w:pPr>
       <w:r>
         <w:rPr>
-          <w:rFonts w:ascii="Aptos" w:hAnsi="Aptos" w:eastAsia="PingFang SC"/>
+          <w:rFonts w:ascii="PingFang SC" w:hAnsi="PingFang SC" w:eastAsia="PingFang SC" w:cs="PingFang SC" w:hint="eastAsia"/>
           <w:color w:val="1B231F"/>
           <w:sz w:val="20"/>
         </w:rPr>
@@ -280,7 +280,7 @@
       </w:pPr>
       <w:r>
         <w:rPr>
-          <w:rFonts w:ascii="Aptos" w:hAnsi="Aptos" w:eastAsia="PingFang SC"/>
+          <w:rFonts w:ascii="PingFang SC" w:hAnsi="PingFang SC" w:eastAsia="PingFang SC" w:cs="PingFang SC" w:hint="eastAsia"/>
           <w:color w:val="5C6A61"/>
           <w:sz w:val="20"/>
         </w:rPr>
@@ -293,7 +293,7 @@
       </w:pPr>
       <w:r>
         <w:rPr>
-          <w:rFonts w:ascii="Aptos" w:hAnsi="Aptos" w:eastAsia="PingFang SC"/>
+          <w:rFonts w:ascii="PingFang SC" w:hAnsi="PingFang SC" w:eastAsia="PingFang SC" w:cs="PingFang SC" w:hint="eastAsia"/>
           <w:b/>
           <w:color w:val="18352D"/>
           <w:sz w:val="22"/>
@@ -307,7 +307,7 @@
       </w:pPr>
       <w:r>
         <w:rPr>
-          <w:rFonts w:ascii="Aptos" w:hAnsi="Aptos" w:eastAsia="PingFang SC"/>
+          <w:rFonts w:ascii="PingFang SC" w:hAnsi="PingFang SC" w:eastAsia="PingFang SC" w:cs="PingFang SC" w:hint="eastAsia"/>
           <w:color w:val="1B231F"/>
           <w:sz w:val="20"/>
         </w:rPr>
@@ -320,7 +320,7 @@
       </w:pPr>
       <w:r>
         <w:rPr>
-          <w:rFonts w:ascii="Aptos" w:hAnsi="Aptos" w:eastAsia="PingFang SC"/>
+          <w:rFonts w:ascii="PingFang SC" w:hAnsi="PingFang SC" w:eastAsia="PingFang SC" w:cs="PingFang SC" w:hint="eastAsia"/>
           <w:color w:val="5C6A61"/>
           <w:sz w:val="20"/>
         </w:rPr>
@@ -333,7 +333,7 @@
       </w:pPr>
       <w:r>
         <w:rPr>
-          <w:rFonts w:ascii="Aptos" w:hAnsi="Aptos" w:eastAsia="PingFang SC"/>
+          <w:rFonts w:ascii="PingFang SC" w:hAnsi="PingFang SC" w:eastAsia="PingFang SC" w:cs="PingFang SC" w:hint="eastAsia"/>
           <w:b/>
           <w:color w:val="18352D"/>
           <w:sz w:val="22"/>
@@ -347,7 +347,7 @@
       </w:pPr>
       <w:r>
         <w:rPr>
-          <w:rFonts w:ascii="Aptos" w:hAnsi="Aptos" w:eastAsia="PingFang SC"/>
+          <w:rFonts w:ascii="PingFang SC" w:hAnsi="PingFang SC" w:eastAsia="PingFang SC" w:cs="PingFang SC" w:hint="eastAsia"/>
           <w:color w:val="1B231F"/>
           <w:sz w:val="20"/>
         </w:rPr>
@@ -360,7 +360,7 @@
       </w:pPr>
       <w:r>
         <w:rPr>
-          <w:rFonts w:ascii="Aptos" w:hAnsi="Aptos" w:eastAsia="PingFang SC"/>
+          <w:rFonts w:ascii="PingFang SC" w:hAnsi="PingFang SC" w:eastAsia="PingFang SC" w:cs="PingFang SC" w:hint="eastAsia"/>
           <w:color w:val="5C6A61"/>
           <w:sz w:val="20"/>
         </w:rPr>
@@ -378,7 +378,7 @@
       </w:pPr>
       <w:r>
         <w:rPr>
-          <w:rFonts w:ascii="Aptos" w:hAnsi="Aptos" w:eastAsia="PingFang SC"/>
+          <w:rFonts w:ascii="PingFang SC" w:hAnsi="PingFang SC" w:eastAsia="PingFang SC" w:cs="PingFang SC" w:hint="eastAsia"/>
         </w:rPr>
         <w:t>2. 接入要测试的项目</w:t>
       </w:r>
@@ -389,147 +389,9 @@
       </w:pPr>
       <w:r>
         <w:rPr>
-          <w:rFonts w:ascii="Aptos" w:hAnsi="Aptos" w:eastAsia="PingFang SC"/>
+          <w:rFonts w:ascii="PingFang SC" w:hAnsi="PingFang SC" w:eastAsia="PingFang SC" w:cs="PingFang SC" w:hint="eastAsia"/>
         </w:rPr>
         <w:t>这是第一次使用时最需要完成的设置。点击顶部“详细配置”，左侧会打开项目接入向导。它不会把密码写进项目配置；账号和密钥使用环境变量或凭据引用。</w:t>
-      </w:r>
-    </w:p>
-    <w:p>
-      <w:pPr>
-        <w:spacing w:before="120" w:after="60"/>
-        <w:jc w:val="center"/>
-      </w:pPr>
-      <w:r>
-        <w:drawing>
-          <wp:inline xmlns:a="http://schemas.openxmlformats.org/drawingml/2006/main" xmlns:pic="http://schemas.openxmlformats.org/drawingml/2006/picture">
-            <wp:extent cx="5897880" cy="3317558"/>
-            <wp:docPr id="2" name="Picture 2"/>
-            <wp:cNvGraphicFramePr>
-              <a:graphicFrameLocks noChangeAspect="1"/>
-            </wp:cNvGraphicFramePr>
-            <a:graphic>
-              <a:graphicData uri="http://schemas.openxmlformats.org/drawingml/2006/picture">
-                <pic:pic>
-                  <pic:nvPicPr>
-                    <pic:cNvPr id="0" name="02-project-onboarding-inputs.png"/>
-                    <pic:cNvPicPr/>
-                  </pic:nvPicPr>
-                  <pic:blipFill>
-                    <a:blip r:embed="rId12"/>
-                    <a:stretch>
-                      <a:fillRect/>
-                    </a:stretch>
-                  </pic:blipFill>
-                  <pic:spPr>
-                    <a:xfrm>
-                      <a:off x="0" y="0"/>
-                      <a:ext cx="5897880" cy="3317558"/>
-                    </a:xfrm>
-                    <a:prstGeom prst="rect"/>
-                  </pic:spPr>
-                </pic:pic>
-              </a:graphicData>
-            </a:graphic>
-          </wp:inline>
-        </w:drawing>
-      </w:r>
-    </w:p>
-    <w:p>
-      <w:pPr>
-        <w:spacing w:after="180"/>
-        <w:jc w:val="center"/>
-      </w:pPr>
-      <w:r>
-        <w:rPr>
-          <w:rFonts w:ascii="Aptos" w:hAnsi="Aptos" w:eastAsia="PingFang SC"/>
-          <w:color w:val="5C6A61"/>
-          <w:sz w:val="18"/>
-        </w:rPr>
-        <w:t>图 2：项目接入向导。左侧抽屉只在配置时打开，避免打断日常测试。</w:t>
-      </w:r>
-    </w:p>
-    <w:p>
-      <w:pPr>
-        <w:spacing w:before="200" w:after="60"/>
-      </w:pPr>
-      <w:r>
-        <w:rPr>
-          <w:rFonts w:ascii="Aptos" w:hAnsi="Aptos" w:eastAsia="PingFang SC"/>
-          <w:b/>
-          <w:color w:val="18352D"/>
-          <w:sz w:val="28"/>
-        </w:rPr>
-        <w:t>第一步. 填写项目文件夹</w:t>
-      </w:r>
-    </w:p>
-    <w:p>
-      <w:pPr>
-        <w:spacing w:after="120"/>
-        <w:ind w:left="144"/>
-      </w:pPr>
-      <w:r>
-        <w:rPr>
-          <w:rFonts w:ascii="Aptos" w:hAnsi="Aptos" w:eastAsia="PingFang SC"/>
-          <w:color w:val="1B231F"/>
-          <w:sz w:val="21"/>
-        </w:rPr>
-        <w:t>把要测试的 React、Vite、Next、FastAPI 或 Express 项目所在文件夹填入“项目文件夹”。若项目在当前测试平台目录之外，勾选“允许外部绝对路径”。</w:t>
-      </w:r>
-    </w:p>
-    <w:p>
-      <w:pPr>
-        <w:spacing w:before="200" w:after="60"/>
-      </w:pPr>
-      <w:r>
-        <w:rPr>
-          <w:rFonts w:ascii="Aptos" w:hAnsi="Aptos" w:eastAsia="PingFang SC"/>
-          <w:b/>
-          <w:color w:val="18352D"/>
-          <w:sz w:val="28"/>
-        </w:rPr>
-        <w:t>第二步. 点击自动识别</w:t>
-      </w:r>
-    </w:p>
-    <w:p>
-      <w:pPr>
-        <w:spacing w:after="120"/>
-        <w:ind w:left="144"/>
-      </w:pPr>
-      <w:r>
-        <w:rPr>
-          <w:rFonts w:ascii="Aptos" w:hAnsi="Aptos" w:eastAsia="PingFang SC"/>
-          <w:color w:val="1B231F"/>
-          <w:sz w:val="21"/>
-        </w:rPr>
-        <w:t>系统会猜测项目技术栈、常用安装与启动命令、前端/后端端口和健康检查地址。你可以点击“套用建议”，再按项目实际情况修改。</w:t>
-      </w:r>
-    </w:p>
-    <w:p>
-      <w:pPr>
-        <w:spacing w:before="200" w:after="60"/>
-      </w:pPr>
-      <w:r>
-        <w:rPr>
-          <w:rFonts w:ascii="Aptos" w:hAnsi="Aptos" w:eastAsia="PingFang SC"/>
-          <w:b/>
-          <w:color w:val="18352D"/>
-          <w:sz w:val="28"/>
-        </w:rPr>
-        <w:t>第三步. 测试连接</w:t>
-      </w:r>
-    </w:p>
-    <w:p>
-      <w:pPr>
-        <w:spacing w:after="120"/>
-        <w:ind w:left="144"/>
-      </w:pPr>
-      <w:r>
-        <w:rPr>
-          <w:rFonts w:ascii="Aptos" w:hAnsi="Aptos" w:eastAsia="PingFang SC"/>
-          <w:color w:val="1B231F"/>
-          <w:sz w:val="21"/>
-        </w:rPr>
-        <w:t>点击“测试连接”。成功表示系统能访问项目；失败会告诉你问题属于安装、启动、端口、健康检查或缺少登录账号中的哪一种，并给出白话修复提示。</w:t>
       </w:r>
     </w:p>
     <w:p>
@@ -540,7 +402,143 @@
       </w:pPr>
       <w:r>
         <w:rPr>
-          <w:rFonts w:ascii="Aptos" w:hAnsi="Aptos" w:eastAsia="PingFang SC"/>
+          <w:rFonts w:ascii="PingFang SC" w:hAnsi="PingFang SC" w:eastAsia="PingFang SC" w:cs="PingFang SC" w:hint="eastAsia"/>
+          <w:b/>
+          <w:color w:val="18352D"/>
+          <w:sz w:val="21"/>
+        </w:rPr>
+        <w:t xml:space="preserve">新版向导怎么读  </w:t>
+      </w:r>
+      <w:r>
+        <w:rPr>
+          <w:rFonts w:ascii="PingFang SC" w:hAnsi="PingFang SC" w:eastAsia="PingFang SC" w:cs="PingFang SC" w:hint="eastAsia"/>
+          <w:color w:val="1B231F"/>
+          <w:sz w:val="21"/>
+        </w:rPr>
+        <w:t>页面会先显示“第 1 步：告诉我你要测试哪个项目”。识别成功后才出现下一步按钮；技术栈、端口和命令默认收在“查看系统识别到的技术信息”中，不会打断首次使用。</w:t>
+      </w:r>
+    </w:p>
+    <w:p>
+      <w:pPr>
+        <w:spacing w:before="200" w:after="60"/>
+      </w:pPr>
+      <w:r>
+        <w:rPr>
+          <w:rFonts w:ascii="PingFang SC" w:hAnsi="PingFang SC" w:eastAsia="PingFang SC" w:cs="PingFang SC" w:hint="eastAsia"/>
+          <w:b/>
+          <w:color w:val="18352D"/>
+          <w:sz w:val="28"/>
+        </w:rPr>
+        <w:t>第一步. 告诉系统项目在哪</w:t>
+      </w:r>
+    </w:p>
+    <w:p>
+      <w:pPr>
+        <w:spacing w:after="120"/>
+        <w:ind w:left="144"/>
+      </w:pPr>
+      <w:r>
+        <w:rPr>
+          <w:rFonts w:ascii="PingFang SC" w:hAnsi="PingFang SC" w:eastAsia="PingFang SC" w:cs="PingFang SC" w:hint="eastAsia"/>
+          <w:color w:val="1B231F"/>
+          <w:sz w:val="21"/>
+        </w:rPr>
+        <w:t>在“告诉我你要测试哪个项目”中填写项目文件夹。可以填写 app-under-test，也可以填写完整路径。若项目在当前测试平台目录之外，按提示允许外部路径。</w:t>
+      </w:r>
+    </w:p>
+    <w:p>
+      <w:pPr>
+        <w:spacing w:before="200" w:after="60"/>
+      </w:pPr>
+      <w:r>
+        <w:rPr>
+          <w:rFonts w:ascii="PingFang SC" w:hAnsi="PingFang SC" w:eastAsia="PingFang SC" w:cs="PingFang SC" w:hint="eastAsia"/>
+          <w:b/>
+          <w:color w:val="18352D"/>
+          <w:sz w:val="28"/>
+        </w:rPr>
+        <w:t>第二步. 点击“帮我识别项目”</w:t>
+      </w:r>
+    </w:p>
+    <w:p>
+      <w:pPr>
+        <w:spacing w:after="120"/>
+        <w:ind w:left="144"/>
+      </w:pPr>
+      <w:r>
+        <w:rPr>
+          <w:rFonts w:ascii="PingFang SC" w:hAnsi="PingFang SC" w:eastAsia="PingFang SC" w:cs="PingFang SC" w:hint="eastAsia"/>
+          <w:color w:val="1B231F"/>
+          <w:sz w:val="21"/>
+        </w:rPr>
+        <w:t>系统会自动识别项目类型，并准备启动方式和测试地址。你不需要先理解 Vite、端口或健康检查；它不会修改你的项目代码。</w:t>
+      </w:r>
+    </w:p>
+    <w:p>
+      <w:pPr>
+        <w:spacing w:before="200" w:after="60"/>
+      </w:pPr>
+      <w:r>
+        <w:rPr>
+          <w:rFonts w:ascii="PingFang SC" w:hAnsi="PingFang SC" w:eastAsia="PingFang SC" w:cs="PingFang SC" w:hint="eastAsia"/>
+          <w:b/>
+          <w:color w:val="18352D"/>
+          <w:sz w:val="28"/>
+        </w:rPr>
+        <w:t>第三步. 使用推荐设置</w:t>
+      </w:r>
+    </w:p>
+    <w:p>
+      <w:pPr>
+        <w:spacing w:after="120"/>
+        <w:ind w:left="144"/>
+      </w:pPr>
+      <w:r>
+        <w:rPr>
+          <w:rFonts w:ascii="PingFang SC" w:hAnsi="PingFang SC" w:eastAsia="PingFang SC" w:cs="PingFang SC" w:hint="eastAsia"/>
+          <w:color w:val="1B231F"/>
+          <w:sz w:val="21"/>
+        </w:rPr>
+        <w:t>看到“已找到项目”后，点击“使用推荐设置”。系统会把识别出的设置填入项目配置；如果你的项目有特殊账号或环境变量，再按项目实际情况补充。</w:t>
+      </w:r>
+    </w:p>
+    <w:p>
+      <w:pPr>
+        <w:spacing w:before="200" w:after="60"/>
+      </w:pPr>
+      <w:r>
+        <w:rPr>
+          <w:rFonts w:ascii="PingFang SC" w:hAnsi="PingFang SC" w:eastAsia="PingFang SC" w:cs="PingFang SC" w:hint="eastAsia"/>
+          <w:b/>
+          <w:color w:val="18352D"/>
+          <w:sz w:val="28"/>
+        </w:rPr>
+        <w:t>第四步. 检查能否运行</w:t>
+      </w:r>
+    </w:p>
+    <w:p>
+      <w:pPr>
+        <w:spacing w:after="120"/>
+        <w:ind w:left="144"/>
+      </w:pPr>
+      <w:r>
+        <w:rPr>
+          <w:rFonts w:ascii="PingFang SC" w:hAnsi="PingFang SC" w:eastAsia="PingFang SC" w:cs="PingFang SC" w:hint="eastAsia"/>
+          <w:color w:val="1B231F"/>
+          <w:sz w:val="21"/>
+        </w:rPr>
+        <w:t>点击“检查能否运行”。通过表示系统能访问项目；失败会先用白话告诉你该处理什么。完整的端口、命令和技术诊断收在“查看完整检查结果（高级）”中。</w:t>
+      </w:r>
+    </w:p>
+    <w:p>
+      <w:pPr>
+        <w:spacing w:before="160" w:after="200"/>
+        <w:ind w:left="115" w:right="115"/>
+        <w:shd w:fill="EAF1EB"/>
+      </w:pPr>
+      <w:r>
+        <w:rPr>
+          <w:rFonts w:ascii="PingFang SC" w:hAnsi="PingFang SC" w:eastAsia="PingFang SC" w:cs="PingFang SC" w:hint="eastAsia"/>
           <w:b/>
           <w:color w:val="18352D"/>
           <w:sz w:val="21"/>
@@ -549,11 +547,11 @@
       </w:r>
       <w:r>
         <w:rPr>
-          <w:rFonts w:ascii="Aptos" w:hAnsi="Aptos" w:eastAsia="PingFang SC"/>
+          <w:rFonts w:ascii="PingFang SC" w:hAnsi="PingFang SC" w:eastAsia="PingFang SC" w:cs="PingFang SC" w:hint="eastAsia"/>
           <w:color w:val="1B231F"/>
           <w:sz w:val="21"/>
         </w:rPr>
-        <w:t>只要“测试连接”通过，并且浏览器能打开前端地址，就说明这个项目已经可以成为测试对象。无需先理解 Playwright 或 API。</w:t>
+        <w:t>只要看到“项目已准备好测试”，并且浏览器能打开前端地址，就说明这个项目已经可以成为测试对象。无需先理解 Playwright、端口或 API。</w:t>
       </w:r>
     </w:p>
     <w:p>
@@ -562,7 +560,7 @@
       </w:pPr>
       <w:r>
         <w:rPr>
-          <w:rFonts w:ascii="Aptos" w:hAnsi="Aptos" w:eastAsia="PingFang SC"/>
+          <w:rFonts w:ascii="PingFang SC" w:hAnsi="PingFang SC" w:eastAsia="PingFang SC" w:cs="PingFang SC" w:hint="eastAsia"/>
         </w:rPr>
         <w:t>3. 告诉系统：这次为什么要测</w:t>
       </w:r>
@@ -573,7 +571,7 @@
       </w:pPr>
       <w:r>
         <w:rPr>
-          <w:rFonts w:ascii="Aptos" w:hAnsi="Aptos" w:eastAsia="PingFang SC"/>
+          <w:rFonts w:ascii="PingFang SC" w:hAnsi="PingFang SC" w:eastAsia="PingFang SC" w:cs="PingFang SC" w:hint="eastAsia"/>
         </w:rPr>
         <w:t>测试依据决定 AI 应该关注哪里。你可以用一个或多个来源，不需要全部都有。真实来源读取失败时，系统会明确显示 missing 或权限不足，不会偷偷把演示数据当成你的真实输入。</w:t>
       </w:r>
@@ -584,7 +582,7 @@
       </w:pPr>
       <w:r>
         <w:rPr>
-          <w:rFonts w:ascii="Aptos" w:hAnsi="Aptos" w:eastAsia="PingFang SC"/>
+          <w:rFonts w:ascii="PingFang SC" w:hAnsi="PingFang SC" w:eastAsia="PingFang SC" w:cs="PingFang SC" w:hint="eastAsia"/>
           <w:b/>
           <w:color w:val="18352D"/>
           <w:sz w:val="22"/>
@@ -598,7 +596,7 @@
       </w:pPr>
       <w:r>
         <w:rPr>
-          <w:rFonts w:ascii="Aptos" w:hAnsi="Aptos" w:eastAsia="PingFang SC"/>
+          <w:rFonts w:ascii="PingFang SC" w:hAnsi="PingFang SC" w:eastAsia="PingFang SC" w:cs="PingFang SC" w:hint="eastAsia"/>
           <w:color w:val="1B231F"/>
           <w:sz w:val="20"/>
         </w:rPr>
@@ -611,7 +609,7 @@
       </w:pPr>
       <w:r>
         <w:rPr>
-          <w:rFonts w:ascii="Aptos" w:hAnsi="Aptos" w:eastAsia="PingFang SC"/>
+          <w:rFonts w:ascii="PingFang SC" w:hAnsi="PingFang SC" w:eastAsia="PingFang SC" w:cs="PingFang SC" w:hint="eastAsia"/>
           <w:color w:val="5C6A61"/>
           <w:sz w:val="20"/>
         </w:rPr>
@@ -624,7 +622,7 @@
       </w:pPr>
       <w:r>
         <w:rPr>
-          <w:rFonts w:ascii="Aptos" w:hAnsi="Aptos" w:eastAsia="PingFang SC"/>
+          <w:rFonts w:ascii="PingFang SC" w:hAnsi="PingFang SC" w:eastAsia="PingFang SC" w:cs="PingFang SC" w:hint="eastAsia"/>
           <w:b/>
           <w:color w:val="18352D"/>
           <w:sz w:val="22"/>
@@ -638,7 +636,7 @@
       </w:pPr>
       <w:r>
         <w:rPr>
-          <w:rFonts w:ascii="Aptos" w:hAnsi="Aptos" w:eastAsia="PingFang SC"/>
+          <w:rFonts w:ascii="PingFang SC" w:hAnsi="PingFang SC" w:eastAsia="PingFang SC" w:cs="PingFang SC" w:hint="eastAsia"/>
           <w:color w:val="1B231F"/>
           <w:sz w:val="20"/>
         </w:rPr>
@@ -651,7 +649,7 @@
       </w:pPr>
       <w:r>
         <w:rPr>
-          <w:rFonts w:ascii="Aptos" w:hAnsi="Aptos" w:eastAsia="PingFang SC"/>
+          <w:rFonts w:ascii="PingFang SC" w:hAnsi="PingFang SC" w:eastAsia="PingFang SC" w:cs="PingFang SC" w:hint="eastAsia"/>
           <w:color w:val="5C6A61"/>
           <w:sz w:val="20"/>
         </w:rPr>
@@ -664,7 +662,7 @@
       </w:pPr>
       <w:r>
         <w:rPr>
-          <w:rFonts w:ascii="Aptos" w:hAnsi="Aptos" w:eastAsia="PingFang SC"/>
+          <w:rFonts w:ascii="PingFang SC" w:hAnsi="PingFang SC" w:eastAsia="PingFang SC" w:cs="PingFang SC" w:hint="eastAsia"/>
           <w:b/>
           <w:color w:val="18352D"/>
           <w:sz w:val="22"/>
@@ -678,7 +676,7 @@
       </w:pPr>
       <w:r>
         <w:rPr>
-          <w:rFonts w:ascii="Aptos" w:hAnsi="Aptos" w:eastAsia="PingFang SC"/>
+          <w:rFonts w:ascii="PingFang SC" w:hAnsi="PingFang SC" w:eastAsia="PingFang SC" w:cs="PingFang SC" w:hint="eastAsia"/>
           <w:color w:val="1B231F"/>
           <w:sz w:val="20"/>
         </w:rPr>
@@ -691,7 +689,7 @@
       </w:pPr>
       <w:r>
         <w:rPr>
-          <w:rFonts w:ascii="Aptos" w:hAnsi="Aptos" w:eastAsia="PingFang SC"/>
+          <w:rFonts w:ascii="PingFang SC" w:hAnsi="PingFang SC" w:eastAsia="PingFang SC" w:cs="PingFang SC" w:hint="eastAsia"/>
           <w:color w:val="5C6A61"/>
           <w:sz w:val="20"/>
         </w:rPr>
@@ -704,7 +702,7 @@
       </w:pPr>
       <w:r>
         <w:rPr>
-          <w:rFonts w:ascii="Aptos" w:hAnsi="Aptos" w:eastAsia="PingFang SC"/>
+          <w:rFonts w:ascii="PingFang SC" w:hAnsi="PingFang SC" w:eastAsia="PingFang SC" w:cs="PingFang SC" w:hint="eastAsia"/>
           <w:b/>
           <w:color w:val="18352D"/>
           <w:sz w:val="22"/>
@@ -718,7 +716,7 @@
       </w:pPr>
       <w:r>
         <w:rPr>
-          <w:rFonts w:ascii="Aptos" w:hAnsi="Aptos" w:eastAsia="PingFang SC"/>
+          <w:rFonts w:ascii="PingFang SC" w:hAnsi="PingFang SC" w:eastAsia="PingFang SC" w:cs="PingFang SC" w:hint="eastAsia"/>
           <w:color w:val="1B231F"/>
           <w:sz w:val="20"/>
         </w:rPr>
@@ -731,7 +729,7 @@
       </w:pPr>
       <w:r>
         <w:rPr>
-          <w:rFonts w:ascii="Aptos" w:hAnsi="Aptos" w:eastAsia="PingFang SC"/>
+          <w:rFonts w:ascii="PingFang SC" w:hAnsi="PingFang SC" w:eastAsia="PingFang SC" w:cs="PingFang SC" w:hint="eastAsia"/>
           <w:color w:val="5C6A61"/>
           <w:sz w:val="20"/>
         </w:rPr>
@@ -746,7 +744,7 @@
       </w:pPr>
       <w:r>
         <w:rPr>
-          <w:rFonts w:ascii="Aptos" w:hAnsi="Aptos" w:eastAsia="PingFang SC"/>
+          <w:rFonts w:ascii="PingFang SC" w:hAnsi="PingFang SC" w:eastAsia="PingFang SC" w:cs="PingFang SC" w:hint="eastAsia"/>
           <w:b/>
           <w:color w:val="18352D"/>
           <w:sz w:val="21"/>
@@ -755,7 +753,7 @@
       </w:r>
       <w:r>
         <w:rPr>
-          <w:rFonts w:ascii="Aptos" w:hAnsi="Aptos" w:eastAsia="PingFang SC"/>
+          <w:rFonts w:ascii="PingFang SC" w:hAnsi="PingFang SC" w:eastAsia="PingFang SC" w:cs="PingFang SC" w:hint="eastAsia"/>
           <w:color w:val="1B231F"/>
           <w:sz w:val="21"/>
         </w:rPr>
@@ -768,7 +766,7 @@
       </w:pPr>
       <w:r>
         <w:rPr>
-          <w:rFonts w:ascii="Aptos" w:hAnsi="Aptos" w:eastAsia="PingFang SC"/>
+          <w:rFonts w:ascii="PingFang SC" w:hAnsi="PingFang SC" w:eastAsia="PingFang SC" w:cs="PingFang SC" w:hint="eastAsia"/>
         </w:rPr>
         <w:t>读取后会发生什么</w:t>
       </w:r>
@@ -777,7 +775,7 @@
       <w:pPr/>
       <w:r>
         <w:rPr>
-          <w:rFonts w:ascii="Aptos" w:hAnsi="Aptos" w:eastAsia="PingFang SC"/>
+          <w:rFonts w:ascii="PingFang SC" w:hAnsi="PingFang SC" w:eastAsia="PingFang SC" w:cs="PingFang SC" w:hint="eastAsia"/>
         </w:rPr>
         <w:t>点击“读取来源”后，系统记录每个来源的类型、读取状态、权限状态、内容摘要、可信等级、读取时间和内容哈希。点击“分析影响”后，系统将改动文件、路由、接口和关键词映射为推荐测试场景；没有覆盖到的内容会进入 harness gap，明确告诉你目前缺少什么测试能力。</w:t>
       </w:r>
@@ -793,7 +791,7 @@
       </w:pPr>
       <w:r>
         <w:rPr>
-          <w:rFonts w:ascii="Aptos" w:hAnsi="Aptos" w:eastAsia="PingFang SC"/>
+          <w:rFonts w:ascii="PingFang SC" w:hAnsi="PingFang SC" w:eastAsia="PingFang SC" w:cs="PingFang SC" w:hint="eastAsia"/>
         </w:rPr>
         <w:t>4. 选择测试场景，或让 AI 提出新测试点</w:t>
       </w:r>
@@ -804,7 +802,7 @@
       </w:pPr>
       <w:r>
         <w:rPr>
-          <w:rFonts w:ascii="Aptos" w:hAnsi="Aptos" w:eastAsia="PingFang SC"/>
+          <w:rFonts w:ascii="PingFang SC" w:hAnsi="PingFang SC" w:eastAsia="PingFang SC" w:cs="PingFang SC" w:hint="eastAsia"/>
         </w:rPr>
         <w:t>左下角“测试场景”是可直接执行的能力库，例如登录、权限拦截、列表筛选、创建与编辑、表单校验、接口失败恢复、文件上传、OpenAPI 契约等。选择一个场景后，中间会显示本次要执行的计划。</w:t>
       </w:r>
@@ -815,7 +813,7 @@
       </w:pPr>
       <w:r>
         <w:rPr>
-          <w:rFonts w:ascii="Aptos" w:hAnsi="Aptos" w:eastAsia="PingFang SC"/>
+          <w:rFonts w:ascii="PingFang SC" w:hAnsi="PingFang SC" w:eastAsia="PingFang SC" w:cs="PingFang SC" w:hint="eastAsia"/>
           <w:b/>
           <w:color w:val="18352D"/>
           <w:sz w:val="28"/>
@@ -830,7 +828,7 @@
       </w:pPr>
       <w:r>
         <w:rPr>
-          <w:rFonts w:ascii="Aptos" w:hAnsi="Aptos" w:eastAsia="PingFang SC"/>
+          <w:rFonts w:ascii="PingFang SC" w:hAnsi="PingFang SC" w:eastAsia="PingFang SC" w:cs="PingFang SC" w:hint="eastAsia"/>
           <w:color w:val="1B231F"/>
           <w:sz w:val="21"/>
         </w:rPr>
@@ -843,7 +841,7 @@
       </w:pPr>
       <w:r>
         <w:rPr>
-          <w:rFonts w:ascii="Aptos" w:hAnsi="Aptos" w:eastAsia="PingFang SC"/>
+          <w:rFonts w:ascii="PingFang SC" w:hAnsi="PingFang SC" w:eastAsia="PingFang SC" w:cs="PingFang SC" w:hint="eastAsia"/>
           <w:b/>
           <w:color w:val="18352D"/>
           <w:sz w:val="28"/>
@@ -858,7 +856,7 @@
       </w:pPr>
       <w:r>
         <w:rPr>
-          <w:rFonts w:ascii="Aptos" w:hAnsi="Aptos" w:eastAsia="PingFang SC"/>
+          <w:rFonts w:ascii="PingFang SC" w:hAnsi="PingFang SC" w:eastAsia="PingFang SC" w:cs="PingFang SC" w:hint="eastAsia"/>
           <w:color w:val="1B231F"/>
           <w:sz w:val="21"/>
         </w:rPr>
@@ -871,7 +869,7 @@
       </w:pPr>
       <w:r>
         <w:rPr>
-          <w:rFonts w:ascii="Aptos" w:hAnsi="Aptos" w:eastAsia="PingFang SC"/>
+          <w:rFonts w:ascii="PingFang SC" w:hAnsi="PingFang SC" w:eastAsia="PingFang SC" w:cs="PingFang SC" w:hint="eastAsia"/>
           <w:b/>
           <w:color w:val="18352D"/>
           <w:sz w:val="28"/>
@@ -886,7 +884,7 @@
       </w:pPr>
       <w:r>
         <w:rPr>
-          <w:rFonts w:ascii="Aptos" w:hAnsi="Aptos" w:eastAsia="PingFang SC"/>
+          <w:rFonts w:ascii="PingFang SC" w:hAnsi="PingFang SC" w:eastAsia="PingFang SC" w:cs="PingFang SC" w:hint="eastAsia"/>
           <w:color w:val="1B231F"/>
           <w:sz w:val="21"/>
         </w:rPr>
@@ -901,7 +899,7 @@
       </w:pPr>
       <w:r>
         <w:rPr>
-          <w:rFonts w:ascii="Aptos" w:hAnsi="Aptos" w:eastAsia="PingFang SC"/>
+          <w:rFonts w:ascii="PingFang SC" w:hAnsi="PingFang SC" w:eastAsia="PingFang SC" w:cs="PingFang SC" w:hint="eastAsia"/>
           <w:b/>
           <w:color w:val="18352D"/>
           <w:sz w:val="21"/>
@@ -910,7 +908,7 @@
       </w:r>
       <w:r>
         <w:rPr>
-          <w:rFonts w:ascii="Aptos" w:hAnsi="Aptos" w:eastAsia="PingFang SC"/>
+          <w:rFonts w:ascii="PingFang SC" w:hAnsi="PingFang SC" w:eastAsia="PingFang SC" w:cs="PingFang SC" w:hint="eastAsia"/>
           <w:color w:val="1B231F"/>
           <w:sz w:val="21"/>
         </w:rPr>
@@ -928,7 +926,7 @@
       </w:pPr>
       <w:r>
         <w:rPr>
-          <w:rFonts w:ascii="Aptos" w:hAnsi="Aptos" w:eastAsia="PingFang SC"/>
+          <w:rFonts w:ascii="PingFang SC" w:hAnsi="PingFang SC" w:eastAsia="PingFang SC" w:cs="PingFang SC" w:hint="eastAsia"/>
         </w:rPr>
         <w:t>5. 开始测试后，你该看什么</w:t>
       </w:r>
@@ -939,7 +937,7 @@
       </w:pPr>
       <w:r>
         <w:rPr>
-          <w:rFonts w:ascii="Aptos" w:hAnsi="Aptos" w:eastAsia="PingFang SC"/>
+          <w:rFonts w:ascii="PingFang SC" w:hAnsi="PingFang SC" w:eastAsia="PingFang SC" w:cs="PingFang SC" w:hint="eastAsia"/>
         </w:rPr>
         <w:t>勾选“允许本次会话接管指定浏览器窗口执行测试”，再点击绿色“开始测试”。测试不会只给一个成功或失败；每一步都会对应计划、动作、断言和证据。</w:t>
       </w:r>
@@ -950,7 +948,7 @@
       </w:pPr>
       <w:r>
         <w:rPr>
-          <w:rFonts w:ascii="Aptos" w:hAnsi="Aptos" w:eastAsia="PingFang SC"/>
+          <w:rFonts w:ascii="PingFang SC" w:hAnsi="PingFang SC" w:eastAsia="PingFang SC" w:cs="PingFang SC" w:hint="eastAsia"/>
         </w:rPr>
         <w:t>中间时间线</w:t>
       </w:r>
@@ -959,7 +957,7 @@
       <w:pPr/>
       <w:r>
         <w:rPr>
-          <w:rFonts w:ascii="Aptos" w:hAnsi="Aptos" w:eastAsia="PingFang SC"/>
+          <w:rFonts w:ascii="PingFang SC" w:hAnsi="PingFang SC" w:eastAsia="PingFang SC" w:cs="PingFang SC" w:hint="eastAsia"/>
         </w:rPr>
         <w:t>这里按顺序显示 Agent 做的事：生成计划、打开页面、点击或输入、等待接口、执行断言、重试、生成报告。它回答的是“AI 现在在做什么”。</w:t>
       </w:r>
@@ -970,7 +968,7 @@
       </w:pPr>
       <w:r>
         <w:rPr>
-          <w:rFonts w:ascii="Aptos" w:hAnsi="Aptos" w:eastAsia="PingFang SC"/>
+          <w:rFonts w:ascii="PingFang SC" w:hAnsi="PingFang SC" w:eastAsia="PingFang SC" w:cs="PingFang SC" w:hint="eastAsia"/>
         </w:rPr>
         <w:t>右侧测试结论</w:t>
       </w:r>
@@ -979,7 +977,7 @@
       <w:pPr/>
       <w:r>
         <w:rPr>
-          <w:rFonts w:ascii="Aptos" w:hAnsi="Aptos" w:eastAsia="PingFang SC"/>
+          <w:rFonts w:ascii="PingFang SC" w:hAnsi="PingFang SC" w:eastAsia="PingFang SC" w:cs="PingFang SC" w:hint="eastAsia"/>
         </w:rPr>
         <w:t>这里先给白话结果：通过、失败、阻塞、可能不稳定或证据不足。下方“下一步建议”会告诉你优先检查项目连接、需求、代码、接口还是测试脚本。</w:t>
       </w:r>
@@ -990,7 +988,7 @@
       </w:pPr>
       <w:r>
         <w:rPr>
-          <w:rFonts w:ascii="Aptos" w:hAnsi="Aptos" w:eastAsia="PingFang SC"/>
+          <w:rFonts w:ascii="PingFang SC" w:hAnsi="PingFang SC" w:eastAsia="PingFang SC" w:cs="PingFang SC" w:hint="eastAsia"/>
         </w:rPr>
         <w:t>证据详情</w:t>
       </w:r>
@@ -999,7 +997,7 @@
       <w:pPr/>
       <w:r>
         <w:rPr>
-          <w:rFonts w:ascii="Aptos" w:hAnsi="Aptos" w:eastAsia="PingFang SC"/>
+          <w:rFonts w:ascii="PingFang SC" w:hAnsi="PingFang SC" w:eastAsia="PingFang SC" w:cs="PingFang SC" w:hint="eastAsia"/>
         </w:rPr>
         <w:t>点击顶部“证据详情”或右侧“查看完整证据”，可以打开完整审计面板。你会看到截图、DOM 快照、console 报错、network 请求、trace/video、断言结果、Judge 结论和失败归因。每条 Judge 结论都要引用真实 evidence ID；没有证据时只能输出“证据不足”。</w:t>
       </w:r>
@@ -1012,7 +1010,7 @@
       </w:pPr>
       <w:r>
         <w:rPr>
-          <w:rFonts w:ascii="Aptos" w:hAnsi="Aptos" w:eastAsia="PingFang SC"/>
+          <w:rFonts w:ascii="PingFang SC" w:hAnsi="PingFang SC" w:eastAsia="PingFang SC" w:cs="PingFang SC" w:hint="eastAsia"/>
           <w:b/>
           <w:color w:val="18352D"/>
           <w:sz w:val="21"/>
@@ -1021,7 +1019,7 @@
       </w:r>
       <w:r>
         <w:rPr>
-          <w:rFonts w:ascii="Aptos" w:hAnsi="Aptos" w:eastAsia="PingFang SC"/>
+          <w:rFonts w:ascii="PingFang SC" w:hAnsi="PingFang SC" w:eastAsia="PingFang SC" w:cs="PingFang SC" w:hint="eastAsia"/>
           <w:color w:val="1B231F"/>
           <w:sz w:val="21"/>
         </w:rPr>
@@ -1039,7 +1037,7 @@
       </w:pPr>
       <w:r>
         <w:rPr>
-          <w:rFonts w:ascii="Aptos" w:hAnsi="Aptos" w:eastAsia="PingFang SC"/>
+          <w:rFonts w:ascii="PingFang SC" w:hAnsi="PingFang SC" w:eastAsia="PingFang SC" w:cs="PingFang SC" w:hint="eastAsia"/>
         </w:rPr>
         <w:t>6. 运行结束后：怎么处理和复用</w:t>
       </w:r>
@@ -1050,7 +1048,7 @@
       </w:pPr>
       <w:r>
         <w:rPr>
-          <w:rFonts w:ascii="Aptos" w:hAnsi="Aptos" w:eastAsia="PingFang SC"/>
+          <w:rFonts w:ascii="PingFang SC" w:hAnsi="PingFang SC" w:eastAsia="PingFang SC" w:cs="PingFang SC" w:hint="eastAsia"/>
           <w:b/>
           <w:color w:val="18352D"/>
           <w:sz w:val="22"/>
@@ -1064,7 +1062,7 @@
       </w:pPr>
       <w:r>
         <w:rPr>
-          <w:rFonts w:ascii="Aptos" w:hAnsi="Aptos" w:eastAsia="PingFang SC"/>
+          <w:rFonts w:ascii="PingFang SC" w:hAnsi="PingFang SC" w:eastAsia="PingFang SC" w:cs="PingFang SC" w:hint="eastAsia"/>
           <w:color w:val="1B231F"/>
           <w:sz w:val="20"/>
         </w:rPr>
@@ -1077,7 +1075,7 @@
       </w:pPr>
       <w:r>
         <w:rPr>
-          <w:rFonts w:ascii="Aptos" w:hAnsi="Aptos" w:eastAsia="PingFang SC"/>
+          <w:rFonts w:ascii="PingFang SC" w:hAnsi="PingFang SC" w:eastAsia="PingFang SC" w:cs="PingFang SC" w:hint="eastAsia"/>
           <w:color w:val="5C6A61"/>
           <w:sz w:val="20"/>
         </w:rPr>
@@ -1090,7 +1088,7 @@
       </w:pPr>
       <w:r>
         <w:rPr>
-          <w:rFonts w:ascii="Aptos" w:hAnsi="Aptos" w:eastAsia="PingFang SC"/>
+          <w:rFonts w:ascii="PingFang SC" w:hAnsi="PingFang SC" w:eastAsia="PingFang SC" w:cs="PingFang SC" w:hint="eastAsia"/>
           <w:b/>
           <w:color w:val="18352D"/>
           <w:sz w:val="22"/>
@@ -1104,7 +1102,7 @@
       </w:pPr>
       <w:r>
         <w:rPr>
-          <w:rFonts w:ascii="Aptos" w:hAnsi="Aptos" w:eastAsia="PingFang SC"/>
+          <w:rFonts w:ascii="PingFang SC" w:hAnsi="PingFang SC" w:eastAsia="PingFang SC" w:cs="PingFang SC" w:hint="eastAsia"/>
           <w:color w:val="1B231F"/>
           <w:sz w:val="20"/>
         </w:rPr>
@@ -1117,7 +1115,7 @@
       </w:pPr>
       <w:r>
         <w:rPr>
-          <w:rFonts w:ascii="Aptos" w:hAnsi="Aptos" w:eastAsia="PingFang SC"/>
+          <w:rFonts w:ascii="PingFang SC" w:hAnsi="PingFang SC" w:eastAsia="PingFang SC" w:cs="PingFang SC" w:hint="eastAsia"/>
           <w:color w:val="5C6A61"/>
           <w:sz w:val="20"/>
         </w:rPr>
@@ -1130,7 +1128,7 @@
       </w:pPr>
       <w:r>
         <w:rPr>
-          <w:rFonts w:ascii="Aptos" w:hAnsi="Aptos" w:eastAsia="PingFang SC"/>
+          <w:rFonts w:ascii="PingFang SC" w:hAnsi="PingFang SC" w:eastAsia="PingFang SC" w:cs="PingFang SC" w:hint="eastAsia"/>
           <w:b/>
           <w:color w:val="18352D"/>
           <w:sz w:val="22"/>
@@ -1144,7 +1142,7 @@
       </w:pPr>
       <w:r>
         <w:rPr>
-          <w:rFonts w:ascii="Aptos" w:hAnsi="Aptos" w:eastAsia="PingFang SC"/>
+          <w:rFonts w:ascii="PingFang SC" w:hAnsi="PingFang SC" w:eastAsia="PingFang SC" w:cs="PingFang SC" w:hint="eastAsia"/>
           <w:color w:val="1B231F"/>
           <w:sz w:val="20"/>
         </w:rPr>
@@ -1157,7 +1155,7 @@
       </w:pPr>
       <w:r>
         <w:rPr>
-          <w:rFonts w:ascii="Aptos" w:hAnsi="Aptos" w:eastAsia="PingFang SC"/>
+          <w:rFonts w:ascii="PingFang SC" w:hAnsi="PingFang SC" w:eastAsia="PingFang SC" w:cs="PingFang SC" w:hint="eastAsia"/>
           <w:color w:val="5C6A61"/>
           <w:sz w:val="20"/>
         </w:rPr>
@@ -1170,7 +1168,7 @@
       </w:pPr>
       <w:r>
         <w:rPr>
-          <w:rFonts w:ascii="Aptos" w:hAnsi="Aptos" w:eastAsia="PingFang SC"/>
+          <w:rFonts w:ascii="PingFang SC" w:hAnsi="PingFang SC" w:eastAsia="PingFang SC" w:cs="PingFang SC" w:hint="eastAsia"/>
           <w:b/>
           <w:color w:val="18352D"/>
           <w:sz w:val="22"/>
@@ -1184,7 +1182,7 @@
       </w:pPr>
       <w:r>
         <w:rPr>
-          <w:rFonts w:ascii="Aptos" w:hAnsi="Aptos" w:eastAsia="PingFang SC"/>
+          <w:rFonts w:ascii="PingFang SC" w:hAnsi="PingFang SC" w:eastAsia="PingFang SC" w:cs="PingFang SC" w:hint="eastAsia"/>
           <w:color w:val="1B231F"/>
           <w:sz w:val="20"/>
         </w:rPr>
@@ -1197,7 +1195,7 @@
       </w:pPr>
       <w:r>
         <w:rPr>
-          <w:rFonts w:ascii="Aptos" w:hAnsi="Aptos" w:eastAsia="PingFang SC"/>
+          <w:rFonts w:ascii="PingFang SC" w:hAnsi="PingFang SC" w:eastAsia="PingFang SC" w:cs="PingFang SC" w:hint="eastAsia"/>
           <w:color w:val="5C6A61"/>
           <w:sz w:val="20"/>
         </w:rPr>
@@ -1210,7 +1208,7 @@
       </w:pPr>
       <w:r>
         <w:rPr>
-          <w:rFonts w:ascii="Aptos" w:hAnsi="Aptos" w:eastAsia="PingFang SC"/>
+          <w:rFonts w:ascii="PingFang SC" w:hAnsi="PingFang SC" w:eastAsia="PingFang SC" w:cs="PingFang SC" w:hint="eastAsia"/>
         </w:rPr>
         <w:t>安全边界</w:t>
       </w:r>
@@ -1219,7 +1217,7 @@
       <w:pPr/>
       <w:r>
         <w:rPr>
-          <w:rFonts w:ascii="Aptos" w:hAnsi="Aptos" w:eastAsia="PingFang SC"/>
+          <w:rFonts w:ascii="PingFang SC" w:hAnsi="PingFang SC" w:eastAsia="PingFang SC" w:cs="PingFang SC" w:hint="eastAsia"/>
         </w:rPr>
         <w:t>不要把账号密码、cookie、token 或 webhook 链接直接写进需求、报告和截图说明中。项目配置只保存环境变量或 Credential ID 引用；平台会在 UI、日志、报告与机器人消息中脱敏敏感字段。生产或真实接入环境需要显式 token，不能依赖 dev-local-token。</w:t>
       </w:r>
@@ -1230,7 +1228,7 @@
       </w:pPr>
       <w:r>
         <w:rPr>
-          <w:rFonts w:ascii="Aptos" w:hAnsi="Aptos" w:eastAsia="PingFang SC"/>
+          <w:rFonts w:ascii="PingFang SC" w:hAnsi="PingFang SC" w:eastAsia="PingFang SC" w:cs="PingFang SC" w:hint="eastAsia"/>
         </w:rPr>
         <w:t>最短使用路径</w:t>
       </w:r>
@@ -1239,7 +1237,7 @@
       <w:pPr/>
       <w:r>
         <w:rPr>
-          <w:rFonts w:ascii="Aptos" w:hAnsi="Aptos" w:eastAsia="PingFang SC"/>
+          <w:rFonts w:ascii="PingFang SC" w:hAnsi="PingFang SC" w:eastAsia="PingFang SC" w:cs="PingFang SC" w:hint="eastAsia"/>
         </w:rPr>
         <w:t>配置项目 -&gt; 测试连接 -&gt; 读取来源 -&gt; 分析影响 -&gt; 选择场景 -&gt; 勾选浏览器授权 -&gt; 开始测试 -&gt; 查看结论与完整证据。第一次使用只要按这个顺序走，就能完成一次完整测试。</w:t>
       </w:r>
@@ -1265,7 +1263,7 @@
     </w:pPr>
     <w:r>
       <w:rPr>
-        <w:rFonts w:ascii="Aptos" w:hAnsi="Aptos" w:eastAsia="PingFang SC"/>
+        <w:rFonts w:ascii="PingFang SC" w:hAnsi="PingFang SC" w:eastAsia="PingFang SC" w:cs="PingFang SC" w:hint="eastAsia"/>
         <w:color w:val="5C6A61"/>
         <w:sz w:val="16"/>
       </w:rPr>
@@ -1284,7 +1282,7 @@
     </w:pPr>
     <w:r>
       <w:rPr>
-        <w:rFonts w:ascii="Aptos" w:hAnsi="Aptos" w:eastAsia="PingFang SC"/>
+        <w:rFonts w:ascii="PingFang SC" w:hAnsi="PingFang SC" w:eastAsia="PingFang SC" w:cs="PingFang SC" w:hint="eastAsia"/>
         <w:color w:val="5C6A61"/>
         <w:sz w:val="17"/>
       </w:rPr>
@@ -1661,7 +1659,7 @@
       <w:spacing w:after="120" w:line="283" w:lineRule="auto"/>
     </w:pPr>
     <w:rPr>
-      <w:rFonts w:ascii="Aptos" w:hAnsi="Aptos" w:eastAsia="PingFang SC"/>
+      <w:rFonts w:ascii="PingFang SC" w:hAnsi="PingFang SC" w:eastAsia="PingFang SC"/>
       <w:color w:val="1B231F"/>
       <w:sz w:val="21"/>
     </w:rPr>
@@ -1725,7 +1723,7 @@
       <w:outlineLvl w:val="0"/>
     </w:pPr>
     <w:rPr>
-      <w:rFonts w:asciiTheme="majorHAnsi" w:eastAsiaTheme="majorEastAsia" w:hAnsiTheme="majorHAnsi" w:cstheme="majorBidi" w:ascii="Aptos Display" w:hAnsi="Aptos Display" w:eastAsia="PingFang SC"/>
+      <w:rFonts w:asciiTheme="majorHAnsi" w:eastAsiaTheme="majorEastAsia" w:hAnsiTheme="majorHAnsi" w:cstheme="majorBidi" w:ascii="PingFang SC" w:hAnsi="PingFang SC" w:eastAsia="PingFang SC"/>
       <w:b/>
       <w:bCs/>
       <w:color w:val="18352D"/>
@@ -1749,7 +1747,7 @@
       <w:outlineLvl w:val="1"/>
     </w:pPr>
     <w:rPr>
-      <w:rFonts w:asciiTheme="majorHAnsi" w:eastAsiaTheme="majorEastAsia" w:hAnsiTheme="majorHAnsi" w:cstheme="majorBidi" w:ascii="Aptos" w:hAnsi="Aptos" w:eastAsia="PingFang SC"/>
+      <w:rFonts w:asciiTheme="majorHAnsi" w:eastAsiaTheme="majorEastAsia" w:hAnsiTheme="majorHAnsi" w:cstheme="majorBidi" w:ascii="PingFang SC" w:hAnsi="PingFang SC" w:eastAsia="PingFang SC"/>
       <w:b/>
       <w:bCs/>
       <w:color w:val="18352D"/>
@@ -1773,7 +1771,7 @@
       <w:outlineLvl w:val="2"/>
     </w:pPr>
     <w:rPr>
-      <w:rFonts w:asciiTheme="majorHAnsi" w:eastAsiaTheme="majorEastAsia" w:hAnsiTheme="majorHAnsi" w:cstheme="majorBidi" w:ascii="Aptos" w:hAnsi="Aptos" w:eastAsia="PingFang SC"/>
+      <w:rFonts w:asciiTheme="majorHAnsi" w:eastAsiaTheme="majorEastAsia" w:hAnsiTheme="majorHAnsi" w:cstheme="majorBidi" w:ascii="PingFang SC" w:hAnsi="PingFang SC" w:eastAsia="PingFang SC"/>
       <w:b/>
       <w:bCs/>
       <w:color w:val="18352D"/>

</xml_diff>

<commit_message>
feat: make project onboarding folder-first
</commit_message>
<xml_diff>
--- a/docs/user-guide/AI-Test-Officer-使用说明.docx
+++ b/docs/user-guide/AI-Test-Officer-使用说明.docx
@@ -415,7 +415,7 @@
           <w:color w:val="1B231F"/>
           <w:sz w:val="21"/>
         </w:rPr>
-        <w:t>页面会先显示“第 1 步：告诉我你要测试哪个项目”。识别成功后才出现下一步按钮；技术栈、端口和命令默认收在“查看系统识别到的技术信息”中，不会打断首次使用。</w:t>
+        <w:t>这里现在只保留一个大框。点击“点击上传项目”，选择项目文件夹后，框内会按目录形式列出文件；确认文件夹选对后，再点击蓝色“识别项目”。</w:t>
       </w:r>
     </w:p>
     <w:p>
@@ -429,7 +429,7 @@
           <w:color w:val="18352D"/>
           <w:sz w:val="28"/>
         </w:rPr>
-        <w:t>第一步. 告诉系统项目在哪</w:t>
+        <w:t>第一步. 点击“点击上传项目”</w:t>
       </w:r>
     </w:p>
     <w:p>
@@ -443,7 +443,7 @@
           <w:color w:val="1B231F"/>
           <w:sz w:val="21"/>
         </w:rPr>
-        <w:t>在“告诉我你要测试哪个项目”中填写项目文件夹。可以填写 app-under-test，也可以填写完整路径。若项目在当前测试平台目录之外，按提示允许外部路径。</w:t>
+        <w:t>选择要测试的项目文件夹。系统只读取文件夹结构来准备识别，不会修改项目代码；如果选错，可以点击“重新选择”。</w:t>
       </w:r>
     </w:p>
     <w:p>
@@ -457,7 +457,7 @@
           <w:color w:val="18352D"/>
           <w:sz w:val="28"/>
         </w:rPr>
-        <w:t>第二步. 点击“帮我识别项目”</w:t>
+        <w:t>第二步. 查看目录内容</w:t>
       </w:r>
     </w:p>
     <w:p>
@@ -471,7 +471,7 @@
           <w:color w:val="1B231F"/>
           <w:sz w:val="21"/>
         </w:rPr>
-        <w:t>系统会自动识别项目类型，并准备启动方式和测试地址。你不需要先理解 Vite、端口或健康检查；它不会修改你的项目代码。</w:t>
+        <w:t>选择完成后，大框会显示项目名称、文件数量和目录内容。先确认里面能看到 package.json、src、app 或其他项目文件，再继续。</w:t>
       </w:r>
     </w:p>
     <w:p>
@@ -485,7 +485,7 @@
           <w:color w:val="18352D"/>
           <w:sz w:val="28"/>
         </w:rPr>
-        <w:t>第三步. 使用推荐设置</w:t>
+        <w:t>第三步. 点击“识别项目”</w:t>
       </w:r>
     </w:p>
     <w:p>
@@ -499,35 +499,7 @@
           <w:color w:val="1B231F"/>
           <w:sz w:val="21"/>
         </w:rPr>
-        <w:t>看到“已找到项目”后，点击“使用推荐设置”。系统会把识别出的设置填入项目配置；如果你的项目有特殊账号或环境变量，再按项目实际情况补充。</w:t>
-      </w:r>
-    </w:p>
-    <w:p>
-      <w:pPr>
-        <w:spacing w:before="200" w:after="60"/>
-      </w:pPr>
-      <w:r>
-        <w:rPr>
-          <w:rFonts w:ascii="PingFang SC" w:hAnsi="PingFang SC" w:eastAsia="PingFang SC" w:cs="PingFang SC" w:hint="eastAsia"/>
-          <w:b/>
-          <w:color w:val="18352D"/>
-          <w:sz w:val="28"/>
-        </w:rPr>
-        <w:t>第四步. 检查能否运行</w:t>
-      </w:r>
-    </w:p>
-    <w:p>
-      <w:pPr>
-        <w:spacing w:after="120"/>
-        <w:ind w:left="144"/>
-      </w:pPr>
-      <w:r>
-        <w:rPr>
-          <w:rFonts w:ascii="PingFang SC" w:hAnsi="PingFang SC" w:eastAsia="PingFang SC" w:cs="PingFang SC" w:hint="eastAsia"/>
-          <w:color w:val="1B231F"/>
-          <w:sz w:val="21"/>
-        </w:rPr>
-        <w:t>点击“检查能否运行”。通过表示系统能访问项目；失败会先用白话告诉你该处理什么。完整的端口、命令和技术诊断收在“查看完整检查结果（高级）”中。</w:t>
+        <w:t>系统会根据已选择的项目目录识别技术栈、启动方式、端口和访问地址。识别成功后，再按页面提示使用推荐设置并检查能否运行。</w:t>
       </w:r>
     </w:p>
     <w:p>
@@ -551,7 +523,7 @@
           <w:color w:val="1B231F"/>
           <w:sz w:val="21"/>
         </w:rPr>
-        <w:t>只要看到“项目已准备好测试”，并且浏览器能打开前端地址，就说明这个项目已经可以成为测试对象。无需先理解 Playwright、端口或 API。</w:t>
+        <w:t>你只需要完成“选择文件夹 → 确认目录 → 识别项目”。后续的启动命令、端口和健康检查由系统准备；完整技术信息仍可在高级区域查看。</w:t>
       </w:r>
     </w:p>
     <w:p>

</xml_diff>